<commit_message>
Revisione codice, template bollettino e flusso salvataggio migliorato
- Template bollettino ITA/ENG: rimossa "Dott.ssa Marta Pezzato", allargate celle legenda
- Fix critici: race condition autosave (threading.Lock), SIGTERM handler sincrono,
  soglie bollettino dinamiche, stili openpyxl centralizzati, sessione_giorno semplificata
- Flusso salvataggio: marker GUI parametrizzati con OUTPUT_DIR, dialog si aprono nella
  cartella di lavoro, menu uscita unificato (annuale+bollettini in un passo),
  salvataggio rapido per file ripresi, comando "s" per salvataggio mid-session
- Fix Enter vagante post-filedialog nella GUI

Co-Authored-By: Claude Opus 4.6 <noreply@anthropic.com>
</commit_message>
<xml_diff>
--- a/codice/ENG_Template_Bollettino_pubblicazione.docx
+++ b/codice/ENG_Template_Bollettino_pubblicazione.docx
@@ -335,54 +335,6 @@
           <w:szCs w:val="28"/>
           <w:lang w:val="it-IT"/>
         </w:rPr>
-        <w:t>Dr. Marta Pezzato</w:t>
-      </w:r>
-      <w:r>
-        <w:rPr>
-          <w:rFonts w:ascii="Arial Narrow"/>
-          <w:b/>
-          <w:color w:val="800080"/>
-          <w:spacing w:val="-1"/>
-          <w:sz w:val="18"/>
-          <w:szCs w:val="28"/>
-          <w:lang w:val="it-IT"/>
-        </w:rPr>
-        <w:t xml:space="preserve"> </w:t>
-      </w:r>
-      <w:r>
-        <w:rPr>
-          <w:rFonts w:ascii="Arial Narrow"/>
-          <w:b/>
-          <w:color w:val="800080"/>
-          <w:spacing w:val="-1"/>
-          <w:sz w:val="18"/>
-          <w:szCs w:val="28"/>
-          <w:lang w:val="it-IT"/>
-        </w:rPr>
-        <w:t>–</w:t>
-      </w:r>
-      <w:r>
-        <w:rPr>
-          <w:rFonts w:ascii="Arial Narrow"/>
-          <w:b/>
-          <w:color w:val="800080"/>
-          <w:spacing w:val="-1"/>
-          <w:sz w:val="18"/>
-          <w:szCs w:val="28"/>
-          <w:lang w:val="it-IT"/>
-        </w:rPr>
-        <w:t xml:space="preserve"> </w:t>
-      </w:r>
-      <w:r>
-        <w:rPr>
-          <w:rFonts w:ascii="Arial Narrow"/>
-          <w:b/>
-          <w:color w:val="800080"/>
-          <w:spacing w:val="-1"/>
-          <w:sz w:val="18"/>
-          <w:szCs w:val="28"/>
-          <w:lang w:val="it-IT"/>
-        </w:rPr>
         <w:t>Dott. Mostafa Mohieldin Mahgoub Ibrahim</w:t>
       </w:r>
       <w:r>
@@ -2849,7 +2801,7 @@
     <w:tbl>
       <w:tblPr>
         <w:tblpPr w:leftFromText="141" w:rightFromText="141" w:vertAnchor="text" w:horzAnchor="margin" w:tblpXSpec="center" w:tblpY="95"/>
-        <w:tblW w:w="6269" w:type="dxa"/>
+        <w:tblW w:w="11800" w:type="dxa"/>
         <w:tblCellMar>
           <w:left w:w="70" w:type="dxa"/>
           <w:right w:w="70" w:type="dxa"/>
@@ -2857,11 +2809,11 @@
         <w:tblLook w:val="04A0" w:firstRow="1" w:lastRow="0" w:firstColumn="1" w:lastColumn="0" w:noHBand="0" w:noVBand="1"/>
       </w:tblPr>
       <w:tblGrid>
-        <w:gridCol w:w="2650"/>
-        <w:gridCol w:w="1030"/>
-        <w:gridCol w:w="914"/>
-        <w:gridCol w:w="977"/>
-        <w:gridCol w:w="698"/>
+        <w:gridCol w:w="4200"/>
+        <w:gridCol w:w="2200"/>
+        <w:gridCol w:w="1900"/>
+        <w:gridCol w:w="1900"/>
+        <w:gridCol w:w="1600"/>
       </w:tblGrid>
       <w:tr>
         <w:trPr>
@@ -2869,7 +2821,7 @@
         </w:trPr>
         <w:tc>
           <w:tcPr>
-            <w:tcW w:w="2650" w:type="dxa"/>
+            <w:tcW w:w="4200" w:type="dxa"/>
             <w:tcBorders>
               <w:top w:val="single" w:sz="8" w:space="0" w:color="auto"/>
               <w:left w:val="single" w:sz="8" w:space="0" w:color="auto"/>
@@ -2906,7 +2858,7 @@
         </w:tc>
         <w:tc>
           <w:tcPr>
-            <w:tcW w:w="1030" w:type="dxa"/>
+            <w:tcW w:w="2200" w:type="dxa"/>
             <w:tcBorders>
               <w:top w:val="single" w:sz="8" w:space="0" w:color="auto"/>
               <w:left w:val="nil"/>
@@ -2943,7 +2895,7 @@
         </w:tc>
         <w:tc>
           <w:tcPr>
-            <w:tcW w:w="914" w:type="dxa"/>
+            <w:tcW w:w="1900" w:type="dxa"/>
             <w:tcBorders>
               <w:top w:val="single" w:sz="8" w:space="0" w:color="auto"/>
               <w:left w:val="nil"/>
@@ -2980,7 +2932,7 @@
         </w:tc>
         <w:tc>
           <w:tcPr>
-            <w:tcW w:w="977" w:type="dxa"/>
+            <w:tcW w:w="1900" w:type="dxa"/>
             <w:tcBorders>
               <w:top w:val="single" w:sz="8" w:space="0" w:color="auto"/>
               <w:left w:val="nil"/>
@@ -3017,7 +2969,7 @@
         </w:tc>
         <w:tc>
           <w:tcPr>
-            <w:tcW w:w="698" w:type="dxa"/>
+            <w:tcW w:w="1600" w:type="dxa"/>
             <w:tcBorders>
               <w:top w:val="single" w:sz="8" w:space="0" w:color="auto"/>
               <w:left w:val="nil"/>

</xml_diff>